<commit_message>
feat: update dependencies and refactor code
- Added @monaco-editor/react dependency for Monaco Editor integration.
- Removed unused dependencies: @zumer/snapdom, art-template, and monaco-editor.
- Refactored HtmlTab, PdfTab, and WordTab components to use @monaco-editor/react instead of react-monaco-editor.
- Enhanced WordTab with JSON formatting functionality and improved layout.
- Updated rsbuild.config.js to include SWC loader for JavaScript files.
- Added index.js file for potential future use.
- Updated binary file public/123.docx.
</commit_message>
<xml_diff>
--- a/public/123.docx
+++ b/public/123.docx
@@ -78,19 +78,7 @@
           <w:color w:val="252933"/>
           <w:lang w:val="en-US" w:eastAsia="zh-CN"/>
         </w:rPr>
-        <w:t>{{title</w:t>
-      </w:r>
-      <w:bookmarkStart w:id="0" w:name="_GoBack"/>
-      <w:bookmarkEnd w:id="0"/>
-      <w:r>
-        <w:rPr>
-          <w:rFonts w:hint="eastAsia"/>
-          <w:b/>
-          <w:bCs/>
-          <w:color w:val="252933"/>
-          <w:lang w:val="en-US" w:eastAsia="zh-CN"/>
-        </w:rPr>
-        <w:t>}}</w:t>
+        <w:t>{{title}}</w:t>
       </w:r>
     </w:p>
     <w:p>
@@ -160,9 +148,11 @@
         <w:spacing w:line="440" w:lineRule="atLeast"/>
         <w:jc w:val="left"/>
         <w:rPr>
+          <w:rFonts w:hint="default"/>
           <w:color w:val="8A919F"/>
           <w:sz w:val="28"/>
           <w:szCs w:val="28"/>
+          <w:lang w:val="en-US"/>
         </w:rPr>
       </w:pPr>
       <w:r>
@@ -196,7 +186,31 @@
           <w:szCs w:val="28"/>
           <w:lang w:val="en-US" w:eastAsia="zh-CN" w:bidi="ar"/>
         </w:rPr>
-        <w:t>专栏： 前端</w:t>
+        <w:t>专栏： </w:t>
+      </w:r>
+      <w:r>
+        <w:rPr>
+          <w:rFonts w:hint="eastAsia" w:ascii="宋体" w:hAnsi="宋体" w:cs="宋体"/>
+          <w:color w:val="8A919F"/>
+          <w:kern w:val="0"/>
+          <w:sz w:val="28"/>
+          <w:szCs w:val="28"/>
+          <w:lang w:val="en-US" w:eastAsia="zh-CN" w:bidi="ar"/>
+        </w:rPr>
+        <w:t>{{author}}-</w:t>
+      </w:r>
+      <w:bookmarkStart w:id="0" w:name="_GoBack"/>
+      <w:bookmarkEnd w:id="0"/>
+      <w:r>
+        <w:rPr>
+          <w:rFonts w:hint="eastAsia" w:ascii="宋体" w:hAnsi="宋体" w:cs="宋体"/>
+          <w:color w:val="8A919F"/>
+          <w:kern w:val="0"/>
+          <w:sz w:val="28"/>
+          <w:szCs w:val="28"/>
+          <w:lang w:val="en-US" w:eastAsia="zh-CN" w:bidi="ar"/>
+        </w:rPr>
+        <w:t>{{date}}</w:t>
       </w:r>
     </w:p>
     <w:p>
@@ -252,12 +266,12 @@
       </w:pPr>
       <w:r>
         <w:pict>
-          <v:rect id="_x0000_i1028" o:spt="1" style="height:1.5pt;width:432pt;" fillcolor="#A0A0A0" filled="t" stroked="f" coordsize="21600,21600" o:hr="t" o:hrstd="t" o:hralign="center">
+          <v:rect id="_x0000_i1028" o:spt="1" style="flip:y;height:6pt;width:432pt;" fillcolor="#A0A0A0" filled="t" stroked="f" coordsize="21600,21600" o:hr="t" o:hrstd="t" o:hralign="center">
             <v:path/>
-            <v:fill on="t" focussize="0,0"/>
+            <v:fill on="t" color2="#FFFFFF" focussize="0,0"/>
             <v:stroke on="f"/>
             <v:imagedata o:title=""/>
-            <o:lock v:ext="edit"/>
+            <o:lock v:ext="edit" aspectratio="f"/>
             <w10:wrap type="none"/>
             <w10:anchorlock/>
           </v:rect>
@@ -276,17 +290,48 @@
         </w:pBdr>
         <w:spacing w:before="700" w:beforeAutospacing="0" w:after="200" w:afterAutospacing="0" w:line="520" w:lineRule="atLeast"/>
         <w:rPr>
-          <w:rFonts w:hint="eastAsia" w:eastAsia="宋体"/>
-          <w:lang w:eastAsia="zh-CN"/>
-        </w:rPr>
-      </w:pPr>
-      <w:r>
-        <w:rPr>
           <w:color w:val="252933"/>
           <w:sz w:val="36"/>
           <w:szCs w:val="36"/>
         </w:rPr>
+      </w:pPr>
+      <w:r>
+        <w:rPr>
+          <w:color w:val="252933"/>
+          <w:sz w:val="36"/>
+          <w:szCs w:val="36"/>
+        </w:rPr>
         <w:t>问题根源：为什么数据变化会引起不必要的刷新？</w:t>
+      </w:r>
+    </w:p>
+    <w:p>
+      <w:pPr>
+        <w:rPr>
+          <w:color w:val="252933"/>
+          <w:sz w:val="36"/>
+          <w:szCs w:val="36"/>
+        </w:rPr>
+      </w:pPr>
+    </w:p>
+    <w:p>
+      <w:pPr>
+        <w:rPr>
+          <w:rFonts w:hint="default" w:eastAsia="宋体"/>
+          <w:color w:val="252933"/>
+          <w:sz w:val="36"/>
+          <w:szCs w:val="36"/>
+          <w:lang w:val="en-US" w:eastAsia="zh-CN"/>
+        </w:rPr>
+      </w:pPr>
+      <w:r>
+        <w:rPr>
+          <w:rFonts w:hint="eastAsia"/>
+          <w:color w:val="252933"/>
+          <w:sz w:val="36"/>
+          <w:szCs w:val="36"/>
+          <w:lang w:val="en-US" w:eastAsia="zh-CN"/>
+        </w:rPr>
+        <w:t>{{hello}}</w:t>
       </w:r>
     </w:p>
     <w:p>

</xml_diff>